<commit_message>
feat: add cabinet painting prototype and update project plans
</commit_message>
<xml_diff>
--- a/deliverables/LK_Group_Client_Implementation_Plan_KO.docx
+++ b/deliverables/LK_Group_Client_Implementation_Plan_KO.docx
@@ -36,7 +36,7 @@
           <w:color w:val="555555"/>
           <w:sz w:val="18"/>
         </w:rPr>
-        <w:t>클라이언트 제안서 · 2026년 9월 25일 · 버전 1.0</w:t>
+        <w:t>클라이언트 제안서 · 2026년 9월 27일 · 버전 1.1</w:t>
       </w:r>
     </w:p>
     <w:p>
@@ -75,7 +75,7 @@
           <w:rFonts w:ascii="Malgun Gothic" w:hAnsi="Malgun Gothic" w:eastAsia="Malgun Gothic"/>
           <w:color w:val="000000"/>
         </w:rPr>
-        <w:t>전체 구축은 준비 자료와 담당 인력이 확보된 조건에서 18~24주를 계획 범위로 잡습니다. 총공수는 850~1,270시간이며, 제시한 비용은 계약 견적이 아닌 예산 검토용 가정입니다. 각 단계의 실제 운영 결과에 따라 다음 투자 범위를 결정할 수 있습니다.</w:t>
+        <w:t>우선 제작 목표는 메인 3일, Cabinet 약 1주, 이후 Coatly 기반 회사 관리 웹입니다. 관리 웹은 재사용 범위 확인 후 산정합니다. 전체 확장 계획 18~24주·850~1,270시간과 비용은 인력·자료 확보를 전제로 한 미승인 가정이며 첫 공개 목표와 범위가 다릅니다. 단계별 운영 결과로 다음 투자를 결정하고, 보수와 매출배분은 15장을 기준으로 협의합니다.</w:t>
       </w:r>
     </w:p>
     <w:tbl>
@@ -637,6 +637,66 @@
                 <w:sz w:val="19"/>
               </w:rPr>
               <w:t>14장</w:t>
+            </w:r>
+          </w:p>
+        </w:tc>
+      </w:tr>
+      <w:tr>
+        <w:trPr>
+          <w:cantSplit/>
+        </w:trPr>
+        <w:tc>
+          <w:tcPr>
+            <w:tcW w:type="dxa" w:w="2551"/>
+            <w:vAlign w:val="center"/>
+            <w:tcMar>
+              <w:top w:w="95" w:type="dxa"/>
+              <w:bottom w:w="95" w:type="dxa"/>
+              <w:left w:w="105" w:type="dxa"/>
+              <w:right w:w="105" w:type="dxa"/>
+            </w:tcMar>
+            <w:shd w:fill="FFFFFF"/>
+          </w:tcPr>
+          <w:p>
+            <w:pPr>
+              <w:keepNext w:val="0"/>
+              <w:spacing w:line="274" w:lineRule="auto" w:after="0" w:before="0"/>
+              <w:jc w:val="center"/>
+            </w:pPr>
+            <w:r>
+              <w:rPr>
+                <w:rFonts w:ascii="Malgun Gothic" w:hAnsi="Malgun Gothic" w:eastAsia="Malgun Gothic"/>
+                <w:color w:val="000000"/>
+                <w:sz w:val="19"/>
+              </w:rPr>
+              <w:t>보수와 매출배분 협의</w:t>
+            </w:r>
+          </w:p>
+        </w:tc>
+        <w:tc>
+          <w:tcPr>
+            <w:tcW w:type="dxa" w:w="7087"/>
+            <w:vAlign w:val="center"/>
+            <w:tcMar>
+              <w:top w:w="95" w:type="dxa"/>
+              <w:bottom w:w="95" w:type="dxa"/>
+              <w:left w:w="105" w:type="dxa"/>
+              <w:right w:w="105" w:type="dxa"/>
+            </w:tcMar>
+            <w:shd w:fill="FFFFFF"/>
+          </w:tcPr>
+          <w:p>
+            <w:pPr>
+              <w:keepNext w:val="0"/>
+              <w:spacing w:line="274" w:lineRule="auto" w:after="0" w:before="0"/>
+            </w:pPr>
+            <w:r>
+              <w:rPr>
+                <w:rFonts w:ascii="Malgun Gothic" w:hAnsi="Malgun Gothic" w:eastAsia="Malgun Gothic"/>
+                <w:color w:val="000000"/>
+                <w:sz w:val="19"/>
+              </w:rPr>
+              <w:t>15장</w:t>
             </w:r>
           </w:p>
         </w:tc>
@@ -5294,7 +5354,7 @@
           <w:rFonts w:ascii="Malgun Gothic" w:hAnsi="Malgun Gothic" w:eastAsia="Malgun Gothic"/>
           <w:color w:val="000000"/>
         </w:rPr>
-        <w:t>Next.js는 고객과 관리자 화면을, Supabase는 고객·거래 데이터와 로그인·파일 보관을, Vercel은 운영 배포를 담당합니다. Docker는 개발 환경 재현과 필요한 특수 처리에 사용합니다. 결제는 Stripe를 기본안으로 두고 이메일·주소·회계 도구를 연결합니다.</w:t>
+        <w:t>Next.js는 고객과 관리자 화면을, Supabase는 고객·거래 데이터와 로그인·파일 보관을, Vercel은 운영 배포를 담당합니다. 초기 개발은 Supabase Cloud의 테스트·운영 프로젝트를 분리해 진행합니다. Docker는 초기 필수 설치에서 제외하고, 로컬 DB 실행·검증이나 특수 처리가 필요할 때 선택적으로 사용합니다. 결제는 Stripe를 기본안으로 두고 이메일·주소·회계 도구를 연결합니다.</w:t>
       </w:r>
     </w:p>
     <w:p>
@@ -5331,7 +5391,7 @@
           <w:rFonts w:ascii="Malgun Gothic" w:hAnsi="Malgun Gothic" w:eastAsia="Malgun Gothic"/>
           <w:color w:val="000000"/>
         </w:rPr>
-        <w:t>도메인·소스코드·배포·결제 계정은 고객 소유로 인수합니다. 개발 환경과 운영 환경을 분리하고, 테스트에서 실제 고객에게 메일을 보내거나 실제 결제를 만들지 않도록 설정합니다. 소규모 ERP는 세무 신고와 전체 회계 시스템을 대체하지 않고 회계 자료를 연결합니다.</w:t>
+        <w:t>도메인·배포·결제 등 회사 운영 계정은 회사가 소유·관리하는 방향입니다. 기존 Coatly 코드와 공통 모듈, 회사 전용 결과물의 소유·사용권·양도·재사용 조건은 별도 계약으로 정합니다. 개발 환경과 운영 환경을 분리하고, 테스트에서 실제 고객에게 메일을 보내거나 실제 결제를 만들지 않도록 설정합니다. 소규모 ERP는 세무 신고와 전체 회계 시스템을 대체하지 않고 회계 자료를 연결합니다.</w:t>
       </w:r>
     </w:p>
     <w:p>
@@ -6259,7 +6319,7 @@
           <w:rFonts w:ascii="Malgun Gothic" w:hAnsi="Malgun Gothic" w:eastAsia="Malgun Gothic"/>
           <w:color w:val="000000"/>
         </w:rPr>
-        <w:t>아래는 예산 논의를 위한 산정이며 확정 계약 견적이 아닙니다. 총공수에 혼합 시간당 A$100~140를 적용한 가정입니다. 준비 단계에서 실제 요구사항·담당 인력·서비스 범위를 확정한 뒤 계약 금액을 산정합니다.</w:t>
+        <w:t>아래는 총공수에 혼합 시간당 A$100~140를 적용한 예산 가정이며 확정 견적이 아닙니다. 웹 유입 매출 5%에 모든 구축·유지관리·마케팅 업무가 포함된다는 뜻도 아닙니다. 실제 요구사항·인력·범위를 확인하고 15장의 협의 항목을 기준으로 계약 금액을 정합니다.</w:t>
       </w:r>
     </w:p>
     <w:tbl>
@@ -9473,7 +9533,7 @@
           <w:rFonts w:ascii="Malgun Gothic" w:hAnsi="Malgun Gothic" w:eastAsia="Malgun Gothic"/>
           <w:color w:val="000000"/>
         </w:rPr>
-        <w:t>인수 시 고객 소유 계정, 소스코드, 개발 문서, 관리자 매뉴얼, 가격 변경·환불·재고 조정·장애 복구·식품 회수 절차를 제공합니다. 운영자 교육 2회와 직접 수행하는 인수 테스트를 제안합니다. 미해결 결함과 운영 책임, 유지보수 범위를 명시한 뒤 인수합니다.</w:t>
+        <w:t>인수 시 회사 운영 계정, 계약으로 정한 범위의 소스코드·사용권, 개발 문서, 관리자 매뉴얼, 가격 변경·환불·재고 조정·장애 복구·식품 회수 절차를 제공합니다. 운영자 교육 2회와 직접 수행하는 인수 테스트를 제안합니다. 미해결 결함과 운영 책임, 유지보수 범위를 명시한 뒤 인수합니다.</w:t>
       </w:r>
     </w:p>
     <w:p>
@@ -10478,8 +10538,122 @@
         <w:t>공식 자료 확인일은 2026년 9월 25일입니다. 실제 가입·개발·출시 시점에 요금과 운영 조건을 다시 확인합니다. 일정·공수·광고 성과 수치는 계획 가정이며, 착수 결정과 실제 운영 데이터에 따라 갱신합니다.</w:t>
       </w:r>
     </w:p>
+    <w:p>
+      <w:r>
+        <w:br w:type="page"/>
+      </w:r>
+    </w:p>
+    <w:p>
+      <w:pPr>
+        <w:pStyle w:val="Heading1"/>
+      </w:pPr>
+      <w:r>
+        <w:rPr>
+          <w:rFonts w:ascii="Malgun Gothic" w:hAnsi="Malgun Gothic" w:eastAsia="Malgun Gothic"/>
+          <w:color w:val="000000"/>
+        </w:rPr>
+        <w:t>15 보수와 웹 매출배분 협의</w:t>
+      </w:r>
+    </w:p>
+    <w:p>
+      <w:r>
+        <w:rPr>
+          <w:rFonts w:ascii="Malgun Gothic" w:hAnsi="Malgun Gothic" w:eastAsia="Malgun Gothic"/>
+          <w:color w:val="000000"/>
+        </w:rPr>
+        <w:t>현재 전달된 제안은 웹 유입으로 인정되는 매출의 5%를 배분하는 방식입니다. GST 포함 A$1,100 결제에 대한 배분금은 A$55로 설명되었습니다. 최종 계약 체결 여부는 확인되지 않았으며, 정산 기준과 각 업무의 보수는 추가 협의가 필요합니다.</w:t>
+      </w:r>
+    </w:p>
+    <w:p>
+      <w:r>
+        <w:rPr>
+          <w:rFonts w:ascii="Malgun Gothic" w:hAnsi="Malgun Gothic" w:eastAsia="Malgun Gothic"/>
+          <w:color w:val="000000"/>
+        </w:rPr>
+        <w:t>웹사이트·회사 관리 시스템·AI 견적·자동화의 개발 범위와 보수, 유지관리 시간·지원 범위, 마케팅 산출물과 보수를 정합니다. 초기 구축비와 단계별 개발비, 월 관리비, 웹 매출 성과 보상을 구분하는 안을 협의할 수 있습니다. 분할 지급이나 최소 보수를 선택하면 금액·기한 및 매출배분금과의 관계를 명시합니다.</w:t>
+      </w:r>
+    </w:p>
+    <w:p>
+      <w:r>
+        <w:rPr>
+          <w:rFonts w:ascii="Malgun Gothic" w:hAnsi="Malgun Gothic" w:eastAsia="Malgun Gothic"/>
+          <w:color w:val="000000"/>
+        </w:rPr>
+        <w:t>개발용 AI 비용은 개발자가 부담하고 도메인·서버·사진분석 API 등 회사 운영 실비는 회사에 청구하는 방침을 계약에 반영할 필요가 있습니다. 비용 항목·승인 한도·결제 주체·정산 기한을 확인하고 광고 매체비는 별도 예산으로 협의합니다.</w:t>
+      </w:r>
+    </w:p>
+    <w:p>
+      <w:r>
+        <w:rPr>
+          <w:rFonts w:ascii="Malgun Gothic" w:hAnsi="Malgun Gothic" w:eastAsia="Malgun Gothic"/>
+          <w:color w:val="000000"/>
+        </w:rPr>
+        <w:t>웹 문의 후 전화 계약·계좌이체, 홈페이지를 보고 건 전화, 기존 고객의 온라인 신청, 재구매·추가 공사와 여러 채널을 거친 거래의 인정 범위를 정합니다. 문의 출처와 거래·입금·환불 내역을 연결해 양측이 월별 정산을 확인할 수 있도록 합니다.</w:t>
+      </w:r>
+    </w:p>
+    <w:p>
+      <w:r>
+        <w:rPr>
+          <w:rFonts w:ascii="Malgun Gothic" w:hAnsi="Malgun Gothic" w:eastAsia="Malgun Gothic"/>
+          <w:color w:val="000000"/>
+        </w:rPr>
+        <w:t>GST 포함 매출 기준과 별도로 할인·환불·취소·차지백·예약금·잔금·미수금 처리, 매출 인정 시점과 지급일, 수수료 청구서의 GST 처리를 정합니다. 예약금과 잔금을 중복 집계하지 않으며, 출처 미확인 거래와 정산 이의제기 절차도 합의합니다.</w:t>
+      </w:r>
+    </w:p>
+    <w:p>
+      <w:r>
+        <w:rPr>
+          <w:rFonts w:ascii="Malgun Gothic" w:hAnsi="Malgun Gothic" w:eastAsia="Malgun Gothic"/>
+          <w:color w:val="000000"/>
+        </w:rPr>
+        <w:t>계약 당사자와 대상 사업, 계약 기간, 추가 업무의 변경 절차, 조기 종료 시 개발비·미지급금·후속 입금 정산, 인수 지원 범위를 정합니다. 기존 코드·공통 모듈·회사 전용 결과물의 권리와 지급 조건은 별도 조항으로 명시합니다. 회사의 가격·업무 승인과 AI 검토 책임, 유지관리 책임 범위도 함께 협의합니다.</w:t>
+      </w:r>
+    </w:p>
+    <w:p>
+      <w:r>
+        <w:rPr>
+          <w:rFonts w:ascii="Malgun Gothic" w:hAnsi="Malgun Gothic" w:eastAsia="Malgun Gothic"/>
+          <w:color w:val="000000"/>
+        </w:rPr>
+        <w:t xml:space="preserve">이 장은 협의할 사항을 정리한 제안이며 합의된 계약 조건이나 법률 문안을 뜻하지 않습니다. 일반적인 계약 작성·협상 항목은 호주 정부의 안내를 참고했습니다. </w:t>
+      </w:r>
+      <w:hyperlink r:id="rId26">
+        <w:r>
+          <w:rPr>
+            <w:rFonts w:ascii="Malgun Gothic" w:hAnsi="Malgun Gothic" w:eastAsia="Malgun Gothic"/>
+            <w:color w:val="254C70"/>
+            <w:u w:val="single"/>
+          </w:rPr>
+          <w:t>계약 작성 안내</w:t>
+        </w:r>
+      </w:hyperlink>
+      <w:r>
+        <w:rPr>
+          <w:rFonts w:ascii="Malgun Gothic" w:hAnsi="Malgun Gothic" w:eastAsia="Malgun Gothic"/>
+          <w:color w:val="000000"/>
+        </w:rPr>
+        <w:t xml:space="preserve">, </w:t>
+      </w:r>
+      <w:hyperlink r:id="rId27">
+        <w:r>
+          <w:rPr>
+            <w:rFonts w:ascii="Malgun Gothic" w:hAnsi="Malgun Gothic" w:eastAsia="Malgun Gothic"/>
+            <w:color w:val="254C70"/>
+            <w:u w:val="single"/>
+          </w:rPr>
+          <w:t>계약 협상 안내</w:t>
+        </w:r>
+      </w:hyperlink>
+      <w:r>
+        <w:rPr>
+          <w:rFonts w:ascii="Malgun Gothic" w:hAnsi="Malgun Gothic" w:eastAsia="Malgun Gothic"/>
+          <w:color w:val="000000"/>
+        </w:rPr>
+        <w:t>. 해당 안내는 2026년 9월 27일 확인했습니다.</w:t>
+      </w:r>
+    </w:p>
     <w:sectPr>
-      <w:footerReference w:type="default" r:id="rId26"/>
+      <w:footerReference w:type="default" r:id="rId28"/>
       <w:pgSz w:w="11906" w:h="16838"/>
       <w:pgMar w:top="1077" w:right="1134" w:bottom="1020" w:left="1134" w:header="720" w:footer="454" w:gutter="0"/>
       <w:cols w:space="720"/>

</xml_diff>